<commit_message>
assignment 2 , sprint 2 updated
</commit_message>
<xml_diff>
--- a/Task1.docx
+++ b/Task1.docx
@@ -4,51 +4,37 @@
   <w:body>
     <w:p>
       <w:pPr>
-        <w:spacing w:line="480" w:lineRule="auto"/>
-        <w:jc w:val="both"/>
-        <w:rPr>
-          <w:rFonts w:ascii="Times New Roman" w:hAnsi="Times New Roman" w:cs="Times New Roman"/>
+        <w:rPr>
           <w:b/>
           <w:bCs/>
-          <w:sz w:val="24"/>
-          <w:szCs w:val="24"/>
-        </w:rPr>
-      </w:pPr>
-      <w:r>
-        <w:rPr>
-          <w:rFonts w:ascii="Times New Roman" w:hAnsi="Times New Roman" w:cs="Times New Roman"/>
+        </w:rPr>
+      </w:pPr>
+      <w:r>
+        <w:rPr>
           <w:b/>
           <w:bCs/>
-          <w:sz w:val="24"/>
-          <w:szCs w:val="24"/>
-        </w:rPr>
-        <w:t>UML Diagram</w:t>
+        </w:rPr>
+        <w:t>UML diagram</w:t>
+      </w:r>
+      <w:r>
+        <w:rPr>
+          <w:b/>
+          <w:bCs/>
+        </w:rPr>
+        <w:t>(draw.io source file is also attached , uml diagram is not getting clear on SS)</w:t>
       </w:r>
     </w:p>
     <w:p>
-      <w:pPr>
-        <w:spacing w:line="480" w:lineRule="auto"/>
-        <w:jc w:val="both"/>
-        <w:rPr>
-          <w:rFonts w:ascii="Times New Roman" w:hAnsi="Times New Roman" w:cs="Times New Roman"/>
-          <w:b/>
-          <w:bCs/>
-          <w:sz w:val="24"/>
-          <w:szCs w:val="24"/>
-        </w:rPr>
-      </w:pPr>
-      <w:r>
-        <w:rPr>
-          <w:rFonts w:ascii="Times New Roman" w:hAnsi="Times New Roman" w:cs="Times New Roman"/>
+      <w:r>
+        <w:rPr>
           <w:noProof/>
-          <w:sz w:val="24"/>
-          <w:szCs w:val="24"/>
-        </w:rPr>
+        </w:rPr>
+        <w:lastRenderedPageBreak/>
         <w:drawing>
-          <wp:inline distT="0" distB="0" distL="0" distR="0" wp14:anchorId="27FD0DF0" wp14:editId="3AD09468">
-            <wp:extent cx="5731510" cy="2593340"/>
+          <wp:inline distT="0" distB="0" distL="0" distR="0" wp14:anchorId="5C133944" wp14:editId="4369E7E3">
+            <wp:extent cx="3441065" cy="8863330"/>
             <wp:effectExtent l="0" t="0" r="0" b="0"/>
-            <wp:docPr id="2051436542" name="Picture 1"/>
+            <wp:docPr id="1683305400" name="Picture 1"/>
             <wp:cNvGraphicFramePr>
               <a:graphicFrameLocks xmlns:a="http://schemas.openxmlformats.org/drawingml/2006/main" noChangeAspect="1"/>
             </wp:cNvGraphicFramePr>
@@ -62,7 +48,7 @@
                     </pic:cNvPicPr>
                   </pic:nvPicPr>
                   <pic:blipFill>
-                    <a:blip r:embed="rId4" cstate="print">
+                    <a:blip r:embed="rId5" cstate="print">
                       <a:extLst>
                         <a:ext uri="{28A0092B-C50C-407E-A947-70E740481C1C}">
                           <a14:useLocalDpi xmlns:a14="http://schemas.microsoft.com/office/drawing/2010/main" val="0"/>
@@ -77,7 +63,7 @@
                   <pic:spPr bwMode="auto">
                     <a:xfrm>
                       <a:off x="0" y="0"/>
-                      <a:ext cx="5731510" cy="2593340"/>
+                      <a:ext cx="3441065" cy="8863330"/>
                     </a:xfrm>
                     <a:prstGeom prst="rect">
                       <a:avLst/>
@@ -96,42 +82,254 @@
     </w:p>
     <w:p>
       <w:pPr>
-        <w:spacing w:line="480" w:lineRule="auto"/>
-        <w:jc w:val="both"/>
-        <w:rPr>
-          <w:rFonts w:ascii="Times New Roman" w:hAnsi="Times New Roman" w:cs="Times New Roman"/>
+        <w:rPr>
           <w:b/>
           <w:bCs/>
-          <w:sz w:val="24"/>
-          <w:szCs w:val="24"/>
-        </w:rPr>
-      </w:pPr>
+          <w:lang w:val="en-PK"/>
+        </w:rPr>
+      </w:pPr>
+      <w:r>
+        <w:rPr>
+          <w:b/>
+          <w:bCs/>
+          <w:lang w:val="en-PK"/>
+        </w:rPr>
+        <w:lastRenderedPageBreak/>
+        <w:t xml:space="preserve">Analysis &amp; Design: Controller Class &amp; UI Flexibility </w:t>
+      </w:r>
     </w:p>
     <w:p>
       <w:pPr>
-        <w:spacing w:line="480" w:lineRule="auto"/>
-        <w:jc w:val="both"/>
-        <w:rPr>
-          <w:rFonts w:ascii="Times New Roman" w:hAnsi="Times New Roman" w:cs="Times New Roman"/>
+        <w:rPr>
+          <w:lang w:val="en-PK"/>
+        </w:rPr>
+      </w:pPr>
+      <w:r>
+        <w:rPr>
+          <w:lang w:val="en-PK"/>
+        </w:rPr>
+        <w:t>The CustomerController class acts as the central mediator in the Model-View-Controller (MVC) design pattern and provides a clear separation between the logic, such as business rules, and the data, used by a Controller, View and Model. It wraps a private List&lt;Customer&gt; model, so that user interfaces can't directly access, carry, or improperly modify the model's data store.</w:t>
+      </w:r>
+    </w:p>
+    <w:p>
+      <w:pPr>
+        <w:rPr>
+          <w:lang w:val="en-PK"/>
+        </w:rPr>
+      </w:pPr>
+      <w:r>
+        <w:rPr>
+          <w:lang w:val="en-PK"/>
+        </w:rPr>
+        <w:t>To handle customer entity life cycles the controller offers four separate CRUD methods:</w:t>
+      </w:r>
+    </w:p>
+    <w:p>
+      <w:pPr>
+        <w:pStyle w:val="ListParagraph"/>
+        <w:numPr>
+          <w:ilvl w:val="0"/>
+          <w:numId w:val="2"/>
+        </w:numPr>
+        <w:rPr>
+          <w:lang w:val="en-PK"/>
+        </w:rPr>
+      </w:pPr>
+      <w:r>
+        <w:rPr>
           <w:b/>
           <w:bCs/>
-          <w:sz w:val="24"/>
-          <w:szCs w:val="24"/>
-        </w:rPr>
-      </w:pPr>
-      <w:r>
-        <w:rPr>
-          <w:rFonts w:ascii="Times New Roman" w:hAnsi="Times New Roman" w:cs="Times New Roman"/>
+          <w:lang w:val="en-PK"/>
+        </w:rPr>
+        <w:t>Create (AddCustomer):</w:t>
+      </w:r>
+      <w:r>
+        <w:rPr>
+          <w:lang w:val="en-PK"/>
+        </w:rPr>
+        <w:t xml:space="preserve"> It evaluates the parameters for classifying customers, creates either a BankStaff or RegularCustomer employee, calculates the next unique Customer number dynamically, stores the created employee in memory and returns the newly created customer.</w:t>
+      </w:r>
+    </w:p>
+    <w:p>
+      <w:pPr>
+        <w:pStyle w:val="ListParagraph"/>
+        <w:numPr>
+          <w:ilvl w:val="0"/>
+          <w:numId w:val="2"/>
+        </w:numPr>
+        <w:rPr>
+          <w:lang w:val="en-PK"/>
+        </w:rPr>
+      </w:pPr>
+      <w:r>
+        <w:rPr>
           <w:b/>
           <w:bCs/>
-          <w:sz w:val="24"/>
-          <w:szCs w:val="24"/>
+          <w:lang w:val="en-PK"/>
+        </w:rPr>
+        <w:t>Read (GetAllCustomers, GetCustomerById)</w:t>
+      </w:r>
+      <w:r>
+        <w:rPr>
+          <w:lang w:val="en-PK"/>
+        </w:rPr>
+        <w:t>: The external layer should be able to bind the data and the underlying collection should be an IReadOnlyList&lt;Customer&gt; to make it more difficult to have additional layers affect the list. GetCustomerById utilizes LINQ predicates to carry out rapid targeted searches by Customer ID.</w:t>
+      </w:r>
+    </w:p>
+    <w:p>
+      <w:pPr>
+        <w:pStyle w:val="ListParagraph"/>
+        <w:numPr>
+          <w:ilvl w:val="0"/>
+          <w:numId w:val="2"/>
+        </w:numPr>
+        <w:rPr>
+          <w:lang w:val="en-PK"/>
+        </w:rPr>
+      </w:pPr>
+      <w:r>
+        <w:rPr>
+          <w:b/>
+          <w:bCs/>
+          <w:lang w:val="en-PK"/>
+        </w:rPr>
+        <w:t>Update (UpdateCustomer):</w:t>
+      </w:r>
+      <w:r>
+        <w:rPr>
+          <w:lang w:val="en-PK"/>
+        </w:rPr>
+        <w:t xml:space="preserve"> Finds customer and passes customer's property updates on to it </w:t>
+      </w:r>
+      <w:proofErr w:type="gramStart"/>
+      <w:r>
+        <w:rPr>
+          <w:lang w:val="en-PK"/>
+        </w:rPr>
+        <w:t>safely.UpdateDetails</w:t>
+      </w:r>
+      <w:proofErr w:type="gramEnd"/>
+      <w:r>
+        <w:rPr>
+          <w:lang w:val="en-PK"/>
+        </w:rPr>
+        <w:t>, to maintain object encapsulation without being able to manipulate the object's fields explcitly.</w:t>
+      </w:r>
+    </w:p>
+    <w:p>
+      <w:pPr>
+        <w:pStyle w:val="ListParagraph"/>
+        <w:numPr>
+          <w:ilvl w:val="0"/>
+          <w:numId w:val="2"/>
+        </w:numPr>
+        <w:rPr>
+          <w:lang w:val="en-PK"/>
+        </w:rPr>
+      </w:pPr>
+      <w:r>
+        <w:rPr>
+          <w:b/>
+          <w:bCs/>
+          <w:lang w:val="en-PK"/>
+        </w:rPr>
+        <w:t>Delete (DeleteCustomer):</w:t>
+      </w:r>
+      <w:r>
+        <w:rPr>
+          <w:lang w:val="en-PK"/>
+        </w:rPr>
+        <w:t xml:space="preserve"> Deletes the customer (and any related accounts) from the collection.</w:t>
+      </w:r>
+    </w:p>
+    <w:p>
+      <w:pPr>
+        <w:rPr>
+          <w:lang w:val="en-PK"/>
+        </w:rPr>
+      </w:pPr>
+      <w:r>
+        <w:rPr>
+          <w:lang w:val="en-PK"/>
+        </w:rPr>
+        <w:t>Not only is there basic CRUD, but the controller also has to control transactional workflows (Deposit, Withdraw, CalculateInterest). Catches the custom domain exceptions (InsufficientFundsException, OverdraftLimitExceededException), wraps them up so that the UI is not crashed, and replaces the domain error with a meaningful Error Status message.</w:t>
+      </w:r>
+    </w:p>
+    <w:p>
+      <w:pPr>
+        <w:rPr>
+          <w:b/>
+          <w:bCs/>
+        </w:rPr>
+      </w:pPr>
+      <w:r>
+        <w:rPr>
+          <w:lang w:val="en-PK"/>
+        </w:rPr>
+        <w:lastRenderedPageBreak/>
+        <w:t xml:space="preserve">UI Flexibility: The presentation tier relies upon the input collector and the visual display in a strict way with the remove of all the business rules, fee logic and collection storage from the Windows Forms (Form1). When KiwiBank moves away from a legacy desktop to an ASP.They can develop a cloud-based Blazor portal or a cross-platform mobile application </w:t>
+      </w:r>
+      <w:proofErr w:type="gramStart"/>
+      <w:r>
+        <w:rPr>
+          <w:lang w:val="en-PK"/>
+        </w:rPr>
+        <w:t>using .They</w:t>
+      </w:r>
+      <w:proofErr w:type="gramEnd"/>
+      <w:r>
+        <w:rPr>
+          <w:lang w:val="en-PK"/>
+        </w:rPr>
+        <w:t xml:space="preserve"> can create a cloud based Blazor portal or a cross Platform mobile app </w:t>
+      </w:r>
+      <w:proofErr w:type="gramStart"/>
+      <w:r>
+        <w:rPr>
+          <w:lang w:val="en-PK"/>
+        </w:rPr>
+        <w:t>using .The</w:t>
+      </w:r>
+      <w:proofErr w:type="gramEnd"/>
+      <w:r>
+        <w:rPr>
+          <w:lang w:val="en-PK"/>
+        </w:rPr>
+        <w:t xml:space="preserve"> domain and controller implementation can be used verbatim across the entire application – even NET MAUI! Enterprise grade, no changes to existing fee structures, interest formula or customer management logic to implement user interface changes.</w:t>
+      </w:r>
+    </w:p>
+    <w:p>
+      <w:pPr>
+        <w:rPr>
+          <w:b/>
+          <w:bCs/>
+        </w:rPr>
+      </w:pPr>
+      <w:r>
+        <w:rPr>
+          <w:b/>
+          <w:bCs/>
+        </w:rPr>
+        <w:t>Task 02</w:t>
+      </w:r>
+    </w:p>
+    <w:p>
+      <w:pPr>
+        <w:rPr>
+          <w:b/>
+          <w:bCs/>
+        </w:rPr>
+      </w:pPr>
+      <w:r>
+        <w:rPr>
+          <w:b/>
+          <w:bCs/>
         </w:rPr>
         <w:drawing>
-          <wp:inline distT="0" distB="0" distL="0" distR="0" wp14:anchorId="7566E4D2" wp14:editId="0B0CBCA1">
-            <wp:extent cx="5731510" cy="2493645"/>
+          <wp:inline distT="0" distB="0" distL="0" distR="0" wp14:anchorId="1DD3918F" wp14:editId="3CB0F542">
+            <wp:extent cx="5731510" cy="5126990"/>
             <wp:effectExtent l="0" t="0" r="0" b="0"/>
-            <wp:docPr id="1859244431" name="Picture 1"/>
+            <wp:docPr id="1845145609" name="Picture 1"/>
             <wp:cNvGraphicFramePr>
               <a:graphicFrameLocks xmlns:a="http://schemas.openxmlformats.org/drawingml/2006/main" noChangeAspect="1"/>
             </wp:cNvGraphicFramePr>
@@ -139,11 +337,11 @@
               <a:graphicData uri="http://schemas.openxmlformats.org/drawingml/2006/picture">
                 <pic:pic xmlns:pic="http://schemas.openxmlformats.org/drawingml/2006/picture">
                   <pic:nvPicPr>
-                    <pic:cNvPr id="1859244431" name=""/>
+                    <pic:cNvPr id="1845145609" name=""/>
                     <pic:cNvPicPr/>
                   </pic:nvPicPr>
                   <pic:blipFill>
-                    <a:blip r:embed="rId5"/>
+                    <a:blip r:embed="rId6"/>
                     <a:stretch>
                       <a:fillRect/>
                     </a:stretch>
@@ -151,7 +349,7 @@
                   <pic:spPr>
                     <a:xfrm>
                       <a:off x="0" y="0"/>
-                      <a:ext cx="5731510" cy="2493645"/>
+                      <a:ext cx="5731510" cy="5126990"/>
                     </a:xfrm>
                     <a:prstGeom prst="rect">
                       <a:avLst/>
@@ -164,253 +362,252 @@
         </w:drawing>
       </w:r>
     </w:p>
-    <w:p>
-      <w:pPr>
-        <w:spacing w:line="480" w:lineRule="auto"/>
-        <w:jc w:val="both"/>
-        <w:rPr>
-          <w:rFonts w:ascii="Times New Roman" w:hAnsi="Times New Roman" w:cs="Times New Roman"/>
-          <w:b/>
-          <w:bCs/>
-          <w:sz w:val="24"/>
-          <w:szCs w:val="24"/>
-        </w:rPr>
-      </w:pPr>
-    </w:p>
-    <w:p>
-      <w:pPr>
-        <w:spacing w:line="480" w:lineRule="auto"/>
-        <w:jc w:val="both"/>
-        <w:rPr>
-          <w:rFonts w:ascii="Times New Roman" w:hAnsi="Times New Roman" w:cs="Times New Roman"/>
-          <w:b/>
-          <w:bCs/>
-          <w:sz w:val="24"/>
-          <w:szCs w:val="24"/>
-        </w:rPr>
-      </w:pPr>
-      <w:r>
-        <w:rPr>
-          <w:rFonts w:ascii="Times New Roman" w:hAnsi="Times New Roman" w:cs="Times New Roman"/>
-          <w:b/>
-          <w:bCs/>
-          <w:sz w:val="24"/>
-          <w:szCs w:val="24"/>
-        </w:rPr>
-        <w:t>Justification</w:t>
-      </w:r>
-    </w:p>
-    <w:p>
-      <w:pPr>
-        <w:spacing w:line="480" w:lineRule="auto"/>
-        <w:jc w:val="both"/>
-        <w:rPr>
-          <w:rFonts w:ascii="Times New Roman" w:hAnsi="Times New Roman" w:cs="Times New Roman"/>
-          <w:sz w:val="24"/>
-          <w:szCs w:val="24"/>
-        </w:rPr>
-      </w:pPr>
-      <w:r>
-        <w:rPr>
-          <w:rFonts w:ascii="Times New Roman" w:hAnsi="Times New Roman" w:cs="Times New Roman"/>
-          <w:sz w:val="24"/>
-          <w:szCs w:val="24"/>
-        </w:rPr>
-        <w:t>Core Object-Oriented Programming (OOP) principles mentioned are Inheritance, Composition which forms a robust and logical banking model in the system architecture.</w:t>
-      </w:r>
-    </w:p>
-    <w:p>
-      <w:pPr>
-        <w:spacing w:line="480" w:lineRule="auto"/>
-        <w:jc w:val="both"/>
-        <w:rPr>
-          <w:rFonts w:ascii="Times New Roman" w:hAnsi="Times New Roman" w:cs="Times New Roman"/>
-          <w:sz w:val="24"/>
-          <w:szCs w:val="24"/>
-        </w:rPr>
-      </w:pPr>
-      <w:r>
-        <w:rPr>
-          <w:rFonts w:ascii="Times New Roman" w:hAnsi="Times New Roman" w:cs="Times New Roman"/>
-          <w:sz w:val="24"/>
-          <w:szCs w:val="24"/>
-        </w:rPr>
-        <w:t xml:space="preserve">Account and Customer are abstract base classes that are supported by the inheritance and polymorphism. By not making it possible to instantiate generic, undefinable accounts and/or </w:t>
-      </w:r>
-      <w:r>
-        <w:rPr>
-          <w:rFonts w:ascii="Times New Roman" w:hAnsi="Times New Roman" w:cs="Times New Roman"/>
-          <w:sz w:val="24"/>
-          <w:szCs w:val="24"/>
-        </w:rPr>
-        <w:lastRenderedPageBreak/>
-        <w:t>customers, this allows only concrete types (e.g. OmniAccount or BankStaff) to be represented in the system. The Account class implements a virtual Deposit method since all deposits are treated the same way and contains attributes that can be shared by all types of accounts (e.g., Balance). On the other hand, the abstract Withdraw method is indicated. With this design pattern, the child classes (EverydayAccount, InvestmentAccount and OmniAccount) must explicitly override the transaction logic that handles overdraft limits and penalties for transactions that fail for each new type of account. Likewise, the Customer hierarchy exploits polymorphism by using an abstract method, ComputeFee. This enables the RegularCustomer to pay a full fee and BankStaff will automatically credit a 50% of the fee.</w:t>
-      </w:r>
-    </w:p>
-    <w:p>
-      <w:pPr>
-        <w:spacing w:line="480" w:lineRule="auto"/>
-        <w:jc w:val="both"/>
-        <w:rPr>
-          <w:rFonts w:ascii="Times New Roman" w:hAnsi="Times New Roman" w:cs="Times New Roman"/>
-          <w:sz w:val="24"/>
-          <w:szCs w:val="24"/>
-        </w:rPr>
-      </w:pPr>
-      <w:r>
-        <w:rPr>
-          <w:rFonts w:ascii="Times New Roman" w:hAnsi="Times New Roman" w:cs="Times New Roman"/>
-          <w:sz w:val="24"/>
-          <w:szCs w:val="24"/>
-        </w:rPr>
-        <w:t>Architecture supports the banking scenario via a strong Composition relationship that also makes use of a Customer entity having a set of Account objects (List&lt;Account&gt;)). This securely wraps the accounts inside the customer's profile, just like in real life, the person does not live without a bank account. In addition, there is a one-to-one relationship, in which every child Account has a reference to its corresponding Customer owner, and vice versa. It's a structural decision that is important for fee processing because an InvestmentAccount or OmniAccount will register a withdrawn amount which has failed when the withdrawal has been made, immediately pinching off the accountOwner.CalculateFee(). This gives the exact penalty depending on the user's particular role, and maintains the cleanliness of the classes because the conditional specification is not hardcoded in the classes themselves.</w:t>
-      </w:r>
-    </w:p>
-    <w:p>
-      <w:pPr>
-        <w:spacing w:line="480" w:lineRule="auto"/>
-        <w:jc w:val="both"/>
-        <w:rPr>
-          <w:rFonts w:ascii="Times New Roman" w:hAnsi="Times New Roman" w:cs="Times New Roman"/>
-          <w:sz w:val="24"/>
-          <w:szCs w:val="24"/>
-        </w:rPr>
-      </w:pPr>
-    </w:p>
-    <w:p>
-      <w:pPr>
-        <w:spacing w:line="480" w:lineRule="auto"/>
-        <w:jc w:val="both"/>
-        <w:rPr>
-          <w:rFonts w:ascii="Times New Roman" w:hAnsi="Times New Roman" w:cs="Times New Roman"/>
-          <w:b/>
-          <w:bCs/>
-          <w:sz w:val="24"/>
-          <w:szCs w:val="24"/>
-        </w:rPr>
-      </w:pPr>
-      <w:r>
-        <w:rPr>
-          <w:rFonts w:ascii="Times New Roman" w:hAnsi="Times New Roman" w:cs="Times New Roman"/>
-          <w:b/>
-          <w:bCs/>
-          <w:sz w:val="24"/>
-          <w:szCs w:val="24"/>
-        </w:rPr>
-        <w:t>Task 03</w:t>
-      </w:r>
-    </w:p>
-    <w:p>
-      <w:pPr>
-        <w:spacing w:line="480" w:lineRule="auto"/>
-        <w:jc w:val="both"/>
-        <w:rPr>
-          <w:rFonts w:ascii="Times New Roman" w:hAnsi="Times New Roman" w:cs="Times New Roman"/>
-          <w:b/>
-          <w:bCs/>
-          <w:sz w:val="24"/>
-          <w:szCs w:val="24"/>
-        </w:rPr>
-      </w:pPr>
-      <w:r>
-        <w:rPr>
-          <w:rFonts w:ascii="Times New Roman" w:hAnsi="Times New Roman" w:cs="Times New Roman"/>
-          <w:b/>
-          <w:bCs/>
-          <w:sz w:val="24"/>
-          <w:szCs w:val="24"/>
-        </w:rPr>
-        <w:t>User flow diagram</w:t>
-      </w:r>
-    </w:p>
-    <w:p>
-      <w:pPr>
-        <w:spacing w:line="480" w:lineRule="auto"/>
-        <w:jc w:val="both"/>
-        <w:rPr>
-          <w:rFonts w:ascii="Times New Roman" w:hAnsi="Times New Roman" w:cs="Times New Roman"/>
-          <w:b/>
-          <w:bCs/>
-          <w:sz w:val="24"/>
-          <w:szCs w:val="24"/>
-        </w:rPr>
-      </w:pPr>
-      <w:r>
-        <w:rPr>
-          <w:noProof/>
-        </w:rPr>
-        <w:lastRenderedPageBreak/>
-        <w:drawing>
-          <wp:inline distT="0" distB="0" distL="0" distR="0" wp14:anchorId="1A0D1F5F" wp14:editId="61A06566">
-            <wp:extent cx="5731510" cy="3678555"/>
-            <wp:effectExtent l="0" t="0" r="0" b="0"/>
-            <wp:docPr id="1222446680" name="Picture 2"/>
-            <wp:cNvGraphicFramePr>
-              <a:graphicFrameLocks xmlns:a="http://schemas.openxmlformats.org/drawingml/2006/main" noChangeAspect="1"/>
-            </wp:cNvGraphicFramePr>
-            <a:graphic xmlns:a="http://schemas.openxmlformats.org/drawingml/2006/main">
-              <a:graphicData uri="http://schemas.openxmlformats.org/drawingml/2006/picture">
-                <pic:pic xmlns:pic="http://schemas.openxmlformats.org/drawingml/2006/picture">
-                  <pic:nvPicPr>
-                    <pic:cNvPr id="0" name="Picture 3"/>
-                    <pic:cNvPicPr>
-                      <a:picLocks noChangeAspect="1" noChangeArrowheads="1"/>
-                    </pic:cNvPicPr>
-                  </pic:nvPicPr>
-                  <pic:blipFill>
-                    <a:blip r:embed="rId6" cstate="print">
-                      <a:extLst>
-                        <a:ext uri="{28A0092B-C50C-407E-A947-70E740481C1C}">
-                          <a14:useLocalDpi xmlns:a14="http://schemas.microsoft.com/office/drawing/2010/main" val="0"/>
-                        </a:ext>
-                      </a:extLst>
-                    </a:blip>
-                    <a:srcRect/>
-                    <a:stretch>
-                      <a:fillRect/>
-                    </a:stretch>
-                  </pic:blipFill>
-                  <pic:spPr bwMode="auto">
-                    <a:xfrm>
-                      <a:off x="0" y="0"/>
-                      <a:ext cx="5731510" cy="3678555"/>
-                    </a:xfrm>
-                    <a:prstGeom prst="rect">
-                      <a:avLst/>
-                    </a:prstGeom>
-                    <a:noFill/>
-                    <a:ln>
-                      <a:noFill/>
-                    </a:ln>
-                  </pic:spPr>
-                </pic:pic>
-              </a:graphicData>
-            </a:graphic>
-          </wp:inline>
-        </w:drawing>
-      </w:r>
-    </w:p>
-    <w:p>
-      <w:pPr>
-        <w:spacing w:line="480" w:lineRule="auto"/>
-        <w:jc w:val="both"/>
-        <w:rPr>
-          <w:rFonts w:ascii="Times New Roman" w:hAnsi="Times New Roman" w:cs="Times New Roman"/>
-          <w:b/>
-          <w:bCs/>
-          <w:sz w:val="24"/>
-          <w:szCs w:val="24"/>
-        </w:rPr>
-      </w:pPr>
-    </w:p>
+    <w:p/>
     <w:sectPr>
       <w:pgSz w:w="11906" w:h="16838"/>
-      <w:pgMar w:top="1440" w:right="1440" w:bottom="1440" w:left="1440" w:header="708" w:footer="708" w:gutter="0"/>
+      <w:pgMar w:top="1440" w:right="1440" w:bottom="1440" w:left="1440" w:header="709" w:footer="709" w:gutter="0"/>
       <w:cols w:space="708"/>
       <w:docGrid w:linePitch="360"/>
     </w:sectPr>
   </w:body>
 </w:document>
+</file>
+
+<file path=word/numbering.xml><?xml version="1.0" encoding="utf-8"?>
+<w:numbering xmlns:wpc="http://schemas.microsoft.com/office/word/2010/wordprocessingCanvas" xmlns:cx="http://schemas.microsoft.com/office/drawing/2014/chartex" xmlns:cx1="http://schemas.microsoft.com/office/drawing/2015/9/8/chartex" xmlns:cx2="http://schemas.microsoft.com/office/drawing/2015/10/21/chartex" xmlns:cx3="http://schemas.microsoft.com/office/drawing/2016/5/9/chartex" xmlns:cx4="http://schemas.microsoft.com/office/drawing/2016/5/10/chartex" xmlns:cx5="http://schemas.microsoft.com/office/drawing/2016/5/11/chartex" xmlns:cx6="http://schemas.microsoft.com/office/drawing/2016/5/12/chartex" xmlns:cx7="http://schemas.microsoft.com/office/drawing/2016/5/13/chartex" xmlns:cx8="http://schemas.microsoft.com/office/drawing/2016/5/14/chartex" xmlns:mc="http://schemas.openxmlformats.org/markup-compatibility/2006" xmlns:aink="http://schemas.microsoft.com/office/drawing/2016/ink" xmlns:am3d="http://schemas.microsoft.com/office/drawing/2017/model3d" xmlns:o="urn:schemas-microsoft-com:office:office" xmlns:oel="http://schemas.microsoft.com/office/2019/extlst" xmlns:r="http://schemas.openxmlformats.org/officeDocument/2006/relationships" xmlns:m="http://schemas.openxmlformats.org/officeDocument/2006/math" xmlns:v="urn:schemas-microsoft-com:vml" xmlns:wp14="http://schemas.microsoft.com/office/word/2010/wordprocessingDrawing" xmlns:wp="http://schemas.openxmlformats.org/drawingml/2006/wordprocessingDrawing" xmlns:w10="urn:schemas-microsoft-com:office:word" xmlns:w="http://schemas.openxmlformats.org/wordprocessingml/2006/main" xmlns:w14="http://schemas.microsoft.com/office/word/2010/wordml" xmlns:w15="http://schemas.microsoft.com/office/word/2012/wordml" xmlns:w16cex="http://schemas.microsoft.com/office/word/2018/wordml/cex" xmlns:w16cid="http://schemas.microsoft.com/office/word/2016/wordml/cid" xmlns:w16="http://schemas.microsoft.com/office/word/2018/wordml" xmlns:w16du="http://schemas.microsoft.com/office/word/2023/wordml/word16du" xmlns:w16sdtdh="http://schemas.microsoft.com/office/word/2020/wordml/sdtdatahash" xmlns:w16sdtfl="http://schemas.microsoft.com/office/word/2024/wordml/sdtformatlock" xmlns:w16se="http://schemas.microsoft.com/office/word/2015/wordml/symex" xmlns:wpg="http://schemas.microsoft.com/office/word/2010/wordprocessingGroup" xmlns:wpi="http://schemas.microsoft.com/office/word/2010/wordprocessingInk" xmlns:wne="http://schemas.microsoft.com/office/word/2006/wordml" xmlns:wps="http://schemas.microsoft.com/office/word/2010/wordprocessingShape" mc:Ignorable="w14 w15 w16se w16cid w16 w16cex w16sdtdh w16sdtfl w16du wp14">
+  <w:abstractNum w:abstractNumId="0" w15:restartNumberingAfterBreak="0">
+    <w:nsid w:val="53133B28"/>
+    <w:multiLevelType w:val="hybridMultilevel"/>
+    <w:tmpl w:val="3E48D264"/>
+    <w:lvl w:ilvl="0" w:tplc="20000001">
+      <w:start w:val="1"/>
+      <w:numFmt w:val="bullet"/>
+      <w:lvlText w:val=""/>
+      <w:lvlJc w:val="left"/>
+      <w:pPr>
+        <w:ind w:left="720" w:hanging="360"/>
+      </w:pPr>
+      <w:rPr>
+        <w:rFonts w:ascii="Symbol" w:hAnsi="Symbol" w:hint="default"/>
+      </w:rPr>
+    </w:lvl>
+    <w:lvl w:ilvl="1" w:tplc="20000003" w:tentative="1">
+      <w:start w:val="1"/>
+      <w:numFmt w:val="bullet"/>
+      <w:lvlText w:val="o"/>
+      <w:lvlJc w:val="left"/>
+      <w:pPr>
+        <w:ind w:left="1440" w:hanging="360"/>
+      </w:pPr>
+      <w:rPr>
+        <w:rFonts w:ascii="Courier New" w:hAnsi="Courier New" w:cs="Courier New" w:hint="default"/>
+      </w:rPr>
+    </w:lvl>
+    <w:lvl w:ilvl="2" w:tplc="20000005" w:tentative="1">
+      <w:start w:val="1"/>
+      <w:numFmt w:val="bullet"/>
+      <w:lvlText w:val=""/>
+      <w:lvlJc w:val="left"/>
+      <w:pPr>
+        <w:ind w:left="2160" w:hanging="360"/>
+      </w:pPr>
+      <w:rPr>
+        <w:rFonts w:ascii="Wingdings" w:hAnsi="Wingdings" w:hint="default"/>
+      </w:rPr>
+    </w:lvl>
+    <w:lvl w:ilvl="3" w:tplc="20000001" w:tentative="1">
+      <w:start w:val="1"/>
+      <w:numFmt w:val="bullet"/>
+      <w:lvlText w:val=""/>
+      <w:lvlJc w:val="left"/>
+      <w:pPr>
+        <w:ind w:left="2880" w:hanging="360"/>
+      </w:pPr>
+      <w:rPr>
+        <w:rFonts w:ascii="Symbol" w:hAnsi="Symbol" w:hint="default"/>
+      </w:rPr>
+    </w:lvl>
+    <w:lvl w:ilvl="4" w:tplc="20000003" w:tentative="1">
+      <w:start w:val="1"/>
+      <w:numFmt w:val="bullet"/>
+      <w:lvlText w:val="o"/>
+      <w:lvlJc w:val="left"/>
+      <w:pPr>
+        <w:ind w:left="3600" w:hanging="360"/>
+      </w:pPr>
+      <w:rPr>
+        <w:rFonts w:ascii="Courier New" w:hAnsi="Courier New" w:cs="Courier New" w:hint="default"/>
+      </w:rPr>
+    </w:lvl>
+    <w:lvl w:ilvl="5" w:tplc="20000005" w:tentative="1">
+      <w:start w:val="1"/>
+      <w:numFmt w:val="bullet"/>
+      <w:lvlText w:val=""/>
+      <w:lvlJc w:val="left"/>
+      <w:pPr>
+        <w:ind w:left="4320" w:hanging="360"/>
+      </w:pPr>
+      <w:rPr>
+        <w:rFonts w:ascii="Wingdings" w:hAnsi="Wingdings" w:hint="default"/>
+      </w:rPr>
+    </w:lvl>
+    <w:lvl w:ilvl="6" w:tplc="20000001" w:tentative="1">
+      <w:start w:val="1"/>
+      <w:numFmt w:val="bullet"/>
+      <w:lvlText w:val=""/>
+      <w:lvlJc w:val="left"/>
+      <w:pPr>
+        <w:ind w:left="5040" w:hanging="360"/>
+      </w:pPr>
+      <w:rPr>
+        <w:rFonts w:ascii="Symbol" w:hAnsi="Symbol" w:hint="default"/>
+      </w:rPr>
+    </w:lvl>
+    <w:lvl w:ilvl="7" w:tplc="20000003" w:tentative="1">
+      <w:start w:val="1"/>
+      <w:numFmt w:val="bullet"/>
+      <w:lvlText w:val="o"/>
+      <w:lvlJc w:val="left"/>
+      <w:pPr>
+        <w:ind w:left="5760" w:hanging="360"/>
+      </w:pPr>
+      <w:rPr>
+        <w:rFonts w:ascii="Courier New" w:hAnsi="Courier New" w:cs="Courier New" w:hint="default"/>
+      </w:rPr>
+    </w:lvl>
+    <w:lvl w:ilvl="8" w:tplc="20000005" w:tentative="1">
+      <w:start w:val="1"/>
+      <w:numFmt w:val="bullet"/>
+      <w:lvlText w:val=""/>
+      <w:lvlJc w:val="left"/>
+      <w:pPr>
+        <w:ind w:left="6480" w:hanging="360"/>
+      </w:pPr>
+      <w:rPr>
+        <w:rFonts w:ascii="Wingdings" w:hAnsi="Wingdings" w:hint="default"/>
+      </w:rPr>
+    </w:lvl>
+  </w:abstractNum>
+  <w:abstractNum w:abstractNumId="1" w15:restartNumberingAfterBreak="0">
+    <w:nsid w:val="708443B0"/>
+    <w:multiLevelType w:val="multilevel"/>
+    <w:tmpl w:val="EC226D08"/>
+    <w:lvl w:ilvl="0">
+      <w:start w:val="1"/>
+      <w:numFmt w:val="decimal"/>
+      <w:lvlText w:val="%1."/>
+      <w:lvlJc w:val="left"/>
+      <w:pPr>
+        <w:tabs>
+          <w:tab w:val="num" w:pos="720"/>
+        </w:tabs>
+        <w:ind w:left="720" w:hanging="360"/>
+      </w:pPr>
+    </w:lvl>
+    <w:lvl w:ilvl="1" w:tentative="1">
+      <w:start w:val="1"/>
+      <w:numFmt w:val="decimal"/>
+      <w:lvlText w:val="%2."/>
+      <w:lvlJc w:val="left"/>
+      <w:pPr>
+        <w:tabs>
+          <w:tab w:val="num" w:pos="1440"/>
+        </w:tabs>
+        <w:ind w:left="1440" w:hanging="360"/>
+      </w:pPr>
+    </w:lvl>
+    <w:lvl w:ilvl="2" w:tentative="1">
+      <w:start w:val="1"/>
+      <w:numFmt w:val="decimal"/>
+      <w:lvlText w:val="%3."/>
+      <w:lvlJc w:val="left"/>
+      <w:pPr>
+        <w:tabs>
+          <w:tab w:val="num" w:pos="2160"/>
+        </w:tabs>
+        <w:ind w:left="2160" w:hanging="360"/>
+      </w:pPr>
+    </w:lvl>
+    <w:lvl w:ilvl="3" w:tentative="1">
+      <w:start w:val="1"/>
+      <w:numFmt w:val="decimal"/>
+      <w:lvlText w:val="%4."/>
+      <w:lvlJc w:val="left"/>
+      <w:pPr>
+        <w:tabs>
+          <w:tab w:val="num" w:pos="2880"/>
+        </w:tabs>
+        <w:ind w:left="2880" w:hanging="360"/>
+      </w:pPr>
+    </w:lvl>
+    <w:lvl w:ilvl="4" w:tentative="1">
+      <w:start w:val="1"/>
+      <w:numFmt w:val="decimal"/>
+      <w:lvlText w:val="%5."/>
+      <w:lvlJc w:val="left"/>
+      <w:pPr>
+        <w:tabs>
+          <w:tab w:val="num" w:pos="3600"/>
+        </w:tabs>
+        <w:ind w:left="3600" w:hanging="360"/>
+      </w:pPr>
+    </w:lvl>
+    <w:lvl w:ilvl="5" w:tentative="1">
+      <w:start w:val="1"/>
+      <w:numFmt w:val="decimal"/>
+      <w:lvlText w:val="%6."/>
+      <w:lvlJc w:val="left"/>
+      <w:pPr>
+        <w:tabs>
+          <w:tab w:val="num" w:pos="4320"/>
+        </w:tabs>
+        <w:ind w:left="4320" w:hanging="360"/>
+      </w:pPr>
+    </w:lvl>
+    <w:lvl w:ilvl="6" w:tentative="1">
+      <w:start w:val="1"/>
+      <w:numFmt w:val="decimal"/>
+      <w:lvlText w:val="%7."/>
+      <w:lvlJc w:val="left"/>
+      <w:pPr>
+        <w:tabs>
+          <w:tab w:val="num" w:pos="5040"/>
+        </w:tabs>
+        <w:ind w:left="5040" w:hanging="360"/>
+      </w:pPr>
+    </w:lvl>
+    <w:lvl w:ilvl="7" w:tentative="1">
+      <w:start w:val="1"/>
+      <w:numFmt w:val="decimal"/>
+      <w:lvlText w:val="%8."/>
+      <w:lvlJc w:val="left"/>
+      <w:pPr>
+        <w:tabs>
+          <w:tab w:val="num" w:pos="5760"/>
+        </w:tabs>
+        <w:ind w:left="5760" w:hanging="360"/>
+      </w:pPr>
+    </w:lvl>
+    <w:lvl w:ilvl="8" w:tentative="1">
+      <w:start w:val="1"/>
+      <w:numFmt w:val="decimal"/>
+      <w:lvlText w:val="%9."/>
+      <w:lvlJc w:val="left"/>
+      <w:pPr>
+        <w:tabs>
+          <w:tab w:val="num" w:pos="6480"/>
+        </w:tabs>
+        <w:ind w:left="6480" w:hanging="360"/>
+      </w:pPr>
+    </w:lvl>
+  </w:abstractNum>
+  <w:num w:numId="1" w16cid:durableId="404575587">
+    <w:abstractNumId w:val="1"/>
+  </w:num>
+  <w:num w:numId="2" w16cid:durableId="717974633">
+    <w:abstractNumId w:val="0"/>
+  </w:num>
+</w:numbering>
 </file>
 
 <file path=word/styles.xml><?xml version="1.0" encoding="utf-8"?>
@@ -428,7 +625,8 @@
     </w:rPrDefault>
     <w:pPrDefault>
       <w:pPr>
-        <w:spacing w:after="160" w:line="259" w:lineRule="auto"/>
+        <w:spacing w:after="160" w:line="480" w:lineRule="auto"/>
+        <w:jc w:val="both"/>
       </w:pPr>
     </w:pPrDefault>
   </w:docDefaults>
@@ -892,7 +1090,7 @@
     <w:semiHidden/>
     <w:unhideWhenUsed/>
     <w:qFormat/>
-    <w:rsid w:val="00A20226"/>
+    <w:rsid w:val="001F23AF"/>
     <w:pPr>
       <w:keepNext/>
       <w:keepLines/>
@@ -915,7 +1113,7 @@
     <w:semiHidden/>
     <w:unhideWhenUsed/>
     <w:qFormat/>
-    <w:rsid w:val="00A20226"/>
+    <w:rsid w:val="001F23AF"/>
     <w:pPr>
       <w:keepNext/>
       <w:keepLines/>
@@ -936,7 +1134,7 @@
     <w:semiHidden/>
     <w:unhideWhenUsed/>
     <w:qFormat/>
-    <w:rsid w:val="00A20226"/>
+    <w:rsid w:val="001F23AF"/>
     <w:pPr>
       <w:keepNext/>
       <w:keepLines/>
@@ -959,7 +1157,7 @@
     <w:semiHidden/>
     <w:unhideWhenUsed/>
     <w:qFormat/>
-    <w:rsid w:val="00A20226"/>
+    <w:rsid w:val="001F23AF"/>
     <w:pPr>
       <w:keepNext/>
       <w:keepLines/>
@@ -980,7 +1178,7 @@
     <w:semiHidden/>
     <w:unhideWhenUsed/>
     <w:qFormat/>
-    <w:rsid w:val="00A20226"/>
+    <w:rsid w:val="001F23AF"/>
     <w:pPr>
       <w:keepNext/>
       <w:keepLines/>
@@ -1003,7 +1201,7 @@
     <w:semiHidden/>
     <w:unhideWhenUsed/>
     <w:qFormat/>
-    <w:rsid w:val="00A20226"/>
+    <w:rsid w:val="001F23AF"/>
     <w:pPr>
       <w:keepNext/>
       <w:keepLines/>
@@ -1089,7 +1287,7 @@
     <w:link w:val="Heading4"/>
     <w:uiPriority w:val="9"/>
     <w:semiHidden/>
-    <w:rsid w:val="00A20226"/>
+    <w:rsid w:val="001F23AF"/>
     <w:rPr>
       <w:rFonts w:eastAsiaTheme="majorEastAsia" w:cstheme="majorBidi"/>
       <w:i/>
@@ -1103,7 +1301,7 @@
     <w:link w:val="Heading5"/>
     <w:uiPriority w:val="9"/>
     <w:semiHidden/>
-    <w:rsid w:val="00A20226"/>
+    <w:rsid w:val="001F23AF"/>
     <w:rPr>
       <w:rFonts w:eastAsiaTheme="majorEastAsia" w:cstheme="majorBidi"/>
       <w:color w:val="2F5496" w:themeColor="accent1" w:themeShade="BF"/>
@@ -1115,7 +1313,7 @@
     <w:link w:val="Heading6"/>
     <w:uiPriority w:val="9"/>
     <w:semiHidden/>
-    <w:rsid w:val="00A20226"/>
+    <w:rsid w:val="001F23AF"/>
     <w:rPr>
       <w:rFonts w:eastAsiaTheme="majorEastAsia" w:cstheme="majorBidi"/>
       <w:i/>
@@ -1129,7 +1327,7 @@
     <w:link w:val="Heading7"/>
     <w:uiPriority w:val="9"/>
     <w:semiHidden/>
-    <w:rsid w:val="00A20226"/>
+    <w:rsid w:val="001F23AF"/>
     <w:rPr>
       <w:rFonts w:eastAsiaTheme="majorEastAsia" w:cstheme="majorBidi"/>
       <w:color w:val="595959" w:themeColor="text1" w:themeTint="A6"/>
@@ -1141,7 +1339,7 @@
     <w:link w:val="Heading8"/>
     <w:uiPriority w:val="9"/>
     <w:semiHidden/>
-    <w:rsid w:val="00A20226"/>
+    <w:rsid w:val="001F23AF"/>
     <w:rPr>
       <w:rFonts w:eastAsiaTheme="majorEastAsia" w:cstheme="majorBidi"/>
       <w:i/>
@@ -1155,7 +1353,7 @@
     <w:link w:val="Heading9"/>
     <w:uiPriority w:val="9"/>
     <w:semiHidden/>
-    <w:rsid w:val="00A20226"/>
+    <w:rsid w:val="001F23AF"/>
     <w:rPr>
       <w:rFonts w:eastAsiaTheme="majorEastAsia" w:cstheme="majorBidi"/>
       <w:color w:val="272727" w:themeColor="text1" w:themeTint="D8"/>
@@ -1168,7 +1366,7 @@
     <w:link w:val="TitleChar"/>
     <w:uiPriority w:val="10"/>
     <w:qFormat/>
-    <w:rsid w:val="00A20226"/>
+    <w:rsid w:val="001F23AF"/>
     <w:pPr>
       <w:spacing w:after="80" w:line="240" w:lineRule="auto"/>
       <w:contextualSpacing/>
@@ -1186,7 +1384,7 @@
     <w:basedOn w:val="DefaultParagraphFont"/>
     <w:link w:val="Title"/>
     <w:uiPriority w:val="10"/>
-    <w:rsid w:val="00A20226"/>
+    <w:rsid w:val="001F23AF"/>
     <w:rPr>
       <w:rFonts w:asciiTheme="majorHAnsi" w:eastAsiaTheme="majorEastAsia" w:hAnsiTheme="majorHAnsi" w:cstheme="majorBidi"/>
       <w:spacing w:val="-10"/>
@@ -1202,7 +1400,7 @@
     <w:link w:val="SubtitleChar"/>
     <w:uiPriority w:val="11"/>
     <w:qFormat/>
-    <w:rsid w:val="00A20226"/>
+    <w:rsid w:val="001F23AF"/>
     <w:pPr>
       <w:numPr>
         <w:ilvl w:val="1"/>
@@ -1221,7 +1419,7 @@
     <w:basedOn w:val="DefaultParagraphFont"/>
     <w:link w:val="Subtitle"/>
     <w:uiPriority w:val="11"/>
-    <w:rsid w:val="00A20226"/>
+    <w:rsid w:val="001F23AF"/>
     <w:rPr>
       <w:rFonts w:eastAsiaTheme="majorEastAsia" w:cstheme="majorBidi"/>
       <w:color w:val="595959" w:themeColor="text1" w:themeTint="A6"/>
@@ -1237,7 +1435,7 @@
     <w:link w:val="QuoteChar"/>
     <w:uiPriority w:val="29"/>
     <w:qFormat/>
-    <w:rsid w:val="00A20226"/>
+    <w:rsid w:val="001F23AF"/>
     <w:pPr>
       <w:spacing w:before="160"/>
       <w:jc w:val="center"/>
@@ -1253,7 +1451,7 @@
     <w:basedOn w:val="DefaultParagraphFont"/>
     <w:link w:val="Quote"/>
     <w:uiPriority w:val="29"/>
-    <w:rsid w:val="00A20226"/>
+    <w:rsid w:val="001F23AF"/>
     <w:rPr>
       <w:i/>
       <w:iCs/>
@@ -1265,7 +1463,7 @@
     <w:basedOn w:val="Normal"/>
     <w:uiPriority w:val="34"/>
     <w:qFormat/>
-    <w:rsid w:val="00A20226"/>
+    <w:rsid w:val="001F23AF"/>
     <w:pPr>
       <w:ind w:left="720"/>
       <w:contextualSpacing/>
@@ -1276,7 +1474,7 @@
     <w:basedOn w:val="DefaultParagraphFont"/>
     <w:uiPriority w:val="21"/>
     <w:qFormat/>
-    <w:rsid w:val="00A20226"/>
+    <w:rsid w:val="001F23AF"/>
     <w:rPr>
       <w:i/>
       <w:iCs/>
@@ -1290,7 +1488,7 @@
     <w:link w:val="IntenseQuoteChar"/>
     <w:uiPriority w:val="30"/>
     <w:qFormat/>
-    <w:rsid w:val="00A20226"/>
+    <w:rsid w:val="001F23AF"/>
     <w:pPr>
       <w:pBdr>
         <w:top w:val="single" w:sz="4" w:space="10" w:color="2F5496" w:themeColor="accent1" w:themeShade="BF"/>
@@ -1311,7 +1509,7 @@
     <w:basedOn w:val="DefaultParagraphFont"/>
     <w:link w:val="IntenseQuote"/>
     <w:uiPriority w:val="30"/>
-    <w:rsid w:val="00A20226"/>
+    <w:rsid w:val="001F23AF"/>
     <w:rPr>
       <w:i/>
       <w:iCs/>
@@ -1323,7 +1521,7 @@
     <w:basedOn w:val="DefaultParagraphFont"/>
     <w:uiPriority w:val="32"/>
     <w:qFormat/>
-    <w:rsid w:val="00A20226"/>
+    <w:rsid w:val="001F23AF"/>
     <w:rPr>
       <w:b/>
       <w:bCs/>

</xml_diff>